<commit_message>
Fix Error 6124 in GenerateCCTestData: Save before Protect; set folderPath to ThisWorkbook.Path
</commit_message>
<xml_diff>
--- a/SampleForTest/Sample_Data_1.docx
+++ b/SampleForTest/Sample_Data_1.docx
@@ -4,7 +4,16 @@
   <w:body>
     <w:p>
       <w:r>
-        <w:t xml:space="preserve">Name: </w:t>
+        <w:rPr>
+          <w:rFonts w:hint="eastAsia"/>
+        </w:rPr>
+        <w:t>姓名</w:t>
+      </w:r>
+      <w:r>
+        <w:rPr>
+          <w:rFonts w:hint="eastAsia"/>
+        </w:rPr>
+        <w:t xml:space="preserve">: </w:t>
       </w:r>
       <w:r>
         <w:fldChar w:fldCharType="begin">
@@ -18,13 +27,31 @@
       </w:r>
       <w:bookmarkStart w:id="0" w:name="UserName"/>
       <w:r>
-        <w:instrText xml:space="preserve"> FORMTEXT </w:instrText>
+        <w:instrText xml:space="preserve"> </w:instrText>
+      </w:r>
+      <w:r>
+        <w:rPr>
+          <w:rFonts w:hint="eastAsia"/>
+        </w:rPr>
+        <w:instrText>FORMTEXT</w:instrText>
+      </w:r>
+      <w:r>
+        <w:instrText xml:space="preserve"> </w:instrText>
       </w:r>
       <w:r>
         <w:fldChar w:fldCharType="separate"/>
       </w:r>
       <w:r>
-        <w:t>User_1</w:t>
+        <w:rPr>
+          <w:rFonts w:hint="eastAsia"/>
+        </w:rPr>
+        <w:t>用户</w:t>
+      </w:r>
+      <w:r>
+        <w:rPr>
+          <w:rFonts w:hint="eastAsia"/>
+        </w:rPr>
+        <w:t>_1</w:t>
       </w:r>
       <w:r>
         <w:fldChar w:fldCharType="end"/>
@@ -33,7 +60,16 @@
     </w:p>
     <w:p>
       <w:r>
-        <w:t xml:space="preserve">Age: </w:t>
+        <w:rPr>
+          <w:rFonts w:hint="eastAsia"/>
+        </w:rPr>
+        <w:t>年龄</w:t>
+      </w:r>
+      <w:r>
+        <w:rPr>
+          <w:rFonts w:hint="eastAsia"/>
+        </w:rPr>
+        <w:t xml:space="preserve">: </w:t>
       </w:r>
       <w:r>
         <w:fldChar w:fldCharType="begin">
@@ -47,7 +83,16 @@
       </w:r>
       <w:bookmarkStart w:id="1" w:name="UserAge"/>
       <w:r>
-        <w:instrText xml:space="preserve"> FORMTEXT </w:instrText>
+        <w:instrText xml:space="preserve"> </w:instrText>
+      </w:r>
+      <w:r>
+        <w:rPr>
+          <w:rFonts w:hint="eastAsia"/>
+        </w:rPr>
+        <w:instrText>FORMTEXT</w:instrText>
+      </w:r>
+      <w:r>
+        <w:instrText xml:space="preserve"> </w:instrText>
       </w:r>
       <w:r>
         <w:fldChar w:fldCharType="separate"/>
@@ -62,7 +107,16 @@
     </w:p>
     <w:p>
       <w:r>
-        <w:t xml:space="preserve">Comments: </w:t>
+        <w:rPr>
+          <w:rFonts w:hint="eastAsia"/>
+        </w:rPr>
+        <w:t>反馈意见</w:t>
+      </w:r>
+      <w:r>
+        <w:rPr>
+          <w:rFonts w:hint="eastAsia"/>
+        </w:rPr>
+        <w:t xml:space="preserve">: </w:t>
       </w:r>
       <w:r>
         <w:fldChar w:fldCharType="begin">
@@ -76,13 +130,37 @@
       </w:r>
       <w:bookmarkStart w:id="2" w:name="Comments"/>
       <w:r>
-        <w:instrText xml:space="preserve"> FORMTEXT </w:instrText>
+        <w:instrText xml:space="preserve"> </w:instrText>
+      </w:r>
+      <w:r>
+        <w:rPr>
+          <w:rFonts w:hint="eastAsia"/>
+        </w:rPr>
+        <w:instrText>FORMTEXT</w:instrText>
+      </w:r>
+      <w:r>
+        <w:instrText xml:space="preserve"> </w:instrText>
       </w:r>
       <w:r>
         <w:fldChar w:fldCharType="separate"/>
       </w:r>
       <w:r>
-        <w:t>Feedback from user 1</w:t>
+        <w:rPr>
+          <w:rFonts w:hint="eastAsia"/>
+        </w:rPr>
+        <w:t>来自用户</w:t>
+      </w:r>
+      <w:r>
+        <w:rPr>
+          <w:rFonts w:hint="eastAsia"/>
+        </w:rPr>
+        <w:t xml:space="preserve"> 1 </w:t>
+      </w:r>
+      <w:r>
+        <w:rPr>
+          <w:rFonts w:hint="eastAsia"/>
+        </w:rPr>
+        <w:t>的测试反馈内容。</w:t>
       </w:r>
       <w:r>
         <w:fldChar w:fldCharType="end"/>
@@ -506,7 +584,7 @@
     <w:link w:val="10"/>
     <w:uiPriority w:val="9"/>
     <w:qFormat/>
-    <w:rsid w:val="006751AC"/>
+    <w:rsid w:val="007434CF"/>
     <w:pPr>
       <w:keepNext/>
       <w:keepLines/>
@@ -529,7 +607,7 @@
     <w:semiHidden/>
     <w:unhideWhenUsed/>
     <w:qFormat/>
-    <w:rsid w:val="006751AC"/>
+    <w:rsid w:val="007434CF"/>
     <w:pPr>
       <w:keepNext/>
       <w:keepLines/>
@@ -552,7 +630,7 @@
     <w:semiHidden/>
     <w:unhideWhenUsed/>
     <w:qFormat/>
-    <w:rsid w:val="006751AC"/>
+    <w:rsid w:val="007434CF"/>
     <w:pPr>
       <w:keepNext/>
       <w:keepLines/>
@@ -575,7 +653,7 @@
     <w:semiHidden/>
     <w:unhideWhenUsed/>
     <w:qFormat/>
-    <w:rsid w:val="006751AC"/>
+    <w:rsid w:val="007434CF"/>
     <w:pPr>
       <w:keepNext/>
       <w:keepLines/>
@@ -598,7 +676,7 @@
     <w:semiHidden/>
     <w:unhideWhenUsed/>
     <w:qFormat/>
-    <w:rsid w:val="006751AC"/>
+    <w:rsid w:val="007434CF"/>
     <w:pPr>
       <w:keepNext/>
       <w:keepLines/>
@@ -621,7 +699,7 @@
     <w:semiHidden/>
     <w:unhideWhenUsed/>
     <w:qFormat/>
-    <w:rsid w:val="006751AC"/>
+    <w:rsid w:val="007434CF"/>
     <w:pPr>
       <w:keepNext/>
       <w:keepLines/>
@@ -644,7 +722,7 @@
     <w:semiHidden/>
     <w:unhideWhenUsed/>
     <w:qFormat/>
-    <w:rsid w:val="006751AC"/>
+    <w:rsid w:val="007434CF"/>
     <w:pPr>
       <w:keepNext/>
       <w:keepLines/>
@@ -667,7 +745,7 @@
     <w:semiHidden/>
     <w:unhideWhenUsed/>
     <w:qFormat/>
-    <w:rsid w:val="006751AC"/>
+    <w:rsid w:val="007434CF"/>
     <w:pPr>
       <w:keepNext/>
       <w:keepLines/>
@@ -687,7 +765,7 @@
     <w:semiHidden/>
     <w:unhideWhenUsed/>
     <w:qFormat/>
-    <w:rsid w:val="006751AC"/>
+    <w:rsid w:val="007434CF"/>
     <w:pPr>
       <w:keepNext/>
       <w:keepLines/>
@@ -730,7 +808,7 @@
     <w:basedOn w:val="a0"/>
     <w:link w:val="1"/>
     <w:uiPriority w:val="9"/>
-    <w:rsid w:val="006751AC"/>
+    <w:rsid w:val="007434CF"/>
     <w:rPr>
       <w:rFonts w:asciiTheme="majorHAnsi" w:eastAsiaTheme="majorEastAsia" w:hAnsiTheme="majorHAnsi" w:cstheme="majorBidi"/>
       <w:color w:val="2E74B5" w:themeColor="accent1" w:themeShade="BF"/>
@@ -744,7 +822,7 @@
     <w:link w:val="2"/>
     <w:uiPriority w:val="9"/>
     <w:semiHidden/>
-    <w:rsid w:val="006751AC"/>
+    <w:rsid w:val="007434CF"/>
     <w:rPr>
       <w:rFonts w:asciiTheme="majorHAnsi" w:eastAsiaTheme="majorEastAsia" w:hAnsiTheme="majorHAnsi" w:cstheme="majorBidi"/>
       <w:color w:val="2E74B5" w:themeColor="accent1" w:themeShade="BF"/>
@@ -758,7 +836,7 @@
     <w:link w:val="3"/>
     <w:uiPriority w:val="9"/>
     <w:semiHidden/>
-    <w:rsid w:val="006751AC"/>
+    <w:rsid w:val="007434CF"/>
     <w:rPr>
       <w:rFonts w:asciiTheme="majorHAnsi" w:eastAsiaTheme="majorEastAsia" w:hAnsiTheme="majorHAnsi" w:cstheme="majorBidi"/>
       <w:color w:val="2E74B5" w:themeColor="accent1" w:themeShade="BF"/>
@@ -772,7 +850,7 @@
     <w:link w:val="4"/>
     <w:uiPriority w:val="9"/>
     <w:semiHidden/>
-    <w:rsid w:val="006751AC"/>
+    <w:rsid w:val="007434CF"/>
     <w:rPr>
       <w:rFonts w:cstheme="majorBidi"/>
       <w:color w:val="2E74B5" w:themeColor="accent1" w:themeShade="BF"/>
@@ -786,7 +864,7 @@
     <w:link w:val="5"/>
     <w:uiPriority w:val="9"/>
     <w:semiHidden/>
-    <w:rsid w:val="006751AC"/>
+    <w:rsid w:val="007434CF"/>
     <w:rPr>
       <w:rFonts w:cstheme="majorBidi"/>
       <w:color w:val="2E74B5" w:themeColor="accent1" w:themeShade="BF"/>
@@ -800,7 +878,7 @@
     <w:link w:val="6"/>
     <w:uiPriority w:val="9"/>
     <w:semiHidden/>
-    <w:rsid w:val="006751AC"/>
+    <w:rsid w:val="007434CF"/>
     <w:rPr>
       <w:rFonts w:cstheme="majorBidi"/>
       <w:b/>
@@ -814,7 +892,7 @@
     <w:link w:val="7"/>
     <w:uiPriority w:val="9"/>
     <w:semiHidden/>
-    <w:rsid w:val="006751AC"/>
+    <w:rsid w:val="007434CF"/>
     <w:rPr>
       <w:rFonts w:cstheme="majorBidi"/>
       <w:b/>
@@ -828,7 +906,7 @@
     <w:link w:val="8"/>
     <w:uiPriority w:val="9"/>
     <w:semiHidden/>
-    <w:rsid w:val="006751AC"/>
+    <w:rsid w:val="007434CF"/>
     <w:rPr>
       <w:rFonts w:cstheme="majorBidi"/>
       <w:color w:val="595959" w:themeColor="text1" w:themeTint="A6"/>
@@ -840,7 +918,7 @@
     <w:link w:val="9"/>
     <w:uiPriority w:val="9"/>
     <w:semiHidden/>
-    <w:rsid w:val="006751AC"/>
+    <w:rsid w:val="007434CF"/>
     <w:rPr>
       <w:rFonts w:eastAsiaTheme="majorEastAsia" w:cstheme="majorBidi"/>
       <w:color w:val="595959" w:themeColor="text1" w:themeTint="A6"/>
@@ -853,7 +931,7 @@
     <w:link w:val="a4"/>
     <w:uiPriority w:val="10"/>
     <w:qFormat/>
-    <w:rsid w:val="006751AC"/>
+    <w:rsid w:val="007434CF"/>
     <w:pPr>
       <w:spacing w:after="80"/>
       <w:contextualSpacing/>
@@ -872,7 +950,7 @@
     <w:basedOn w:val="a0"/>
     <w:link w:val="a3"/>
     <w:uiPriority w:val="10"/>
-    <w:rsid w:val="006751AC"/>
+    <w:rsid w:val="007434CF"/>
     <w:rPr>
       <w:rFonts w:asciiTheme="majorHAnsi" w:eastAsiaTheme="majorEastAsia" w:hAnsiTheme="majorHAnsi" w:cstheme="majorBidi"/>
       <w:spacing w:val="-10"/>
@@ -888,7 +966,7 @@
     <w:link w:val="a6"/>
     <w:uiPriority w:val="11"/>
     <w:qFormat/>
-    <w:rsid w:val="006751AC"/>
+    <w:rsid w:val="007434CF"/>
     <w:pPr>
       <w:numPr>
         <w:ilvl w:val="1"/>
@@ -909,7 +987,7 @@
     <w:basedOn w:val="a0"/>
     <w:link w:val="a5"/>
     <w:uiPriority w:val="11"/>
-    <w:rsid w:val="006751AC"/>
+    <w:rsid w:val="007434CF"/>
     <w:rPr>
       <w:rFonts w:asciiTheme="majorHAnsi" w:eastAsiaTheme="majorEastAsia" w:hAnsiTheme="majorHAnsi" w:cstheme="majorBidi"/>
       <w:color w:val="595959" w:themeColor="text1" w:themeTint="A6"/>
@@ -925,7 +1003,7 @@
     <w:link w:val="a8"/>
     <w:uiPriority w:val="29"/>
     <w:qFormat/>
-    <w:rsid w:val="006751AC"/>
+    <w:rsid w:val="007434CF"/>
     <w:pPr>
       <w:spacing w:before="160" w:after="160"/>
       <w:jc w:val="center"/>
@@ -941,7 +1019,7 @@
     <w:basedOn w:val="a0"/>
     <w:link w:val="a7"/>
     <w:uiPriority w:val="29"/>
-    <w:rsid w:val="006751AC"/>
+    <w:rsid w:val="007434CF"/>
     <w:rPr>
       <w:i/>
       <w:iCs/>
@@ -953,7 +1031,7 @@
     <w:basedOn w:val="a"/>
     <w:uiPriority w:val="34"/>
     <w:qFormat/>
-    <w:rsid w:val="006751AC"/>
+    <w:rsid w:val="007434CF"/>
     <w:pPr>
       <w:ind w:left="720"/>
       <w:contextualSpacing/>
@@ -964,7 +1042,7 @@
     <w:basedOn w:val="a0"/>
     <w:uiPriority w:val="21"/>
     <w:qFormat/>
-    <w:rsid w:val="006751AC"/>
+    <w:rsid w:val="007434CF"/>
     <w:rPr>
       <w:i/>
       <w:iCs/>
@@ -978,7 +1056,7 @@
     <w:link w:val="ac"/>
     <w:uiPriority w:val="30"/>
     <w:qFormat/>
-    <w:rsid w:val="006751AC"/>
+    <w:rsid w:val="007434CF"/>
     <w:pPr>
       <w:pBdr>
         <w:top w:val="single" w:sz="4" w:space="10" w:color="2E74B5" w:themeColor="accent1" w:themeShade="BF"/>
@@ -999,7 +1077,7 @@
     <w:basedOn w:val="a0"/>
     <w:link w:val="ab"/>
     <w:uiPriority w:val="30"/>
-    <w:rsid w:val="006751AC"/>
+    <w:rsid w:val="007434CF"/>
     <w:rPr>
       <w:i/>
       <w:iCs/>
@@ -1011,7 +1089,7 @@
     <w:basedOn w:val="a0"/>
     <w:uiPriority w:val="32"/>
     <w:qFormat/>
-    <w:rsid w:val="006751AC"/>
+    <w:rsid w:val="007434CF"/>
     <w:rPr>
       <w:b/>
       <w:bCs/>

</xml_diff>